<commit_message>
Fix summary heading, widths and spacing on sample first page
</commit_message>
<xml_diff>
--- a/examples/musk-full-dialogue/SpaceX_Tesla_xAI_马斯克访谈完整纪要.docx
+++ b/examples/musk-full-dialogue/SpaceX_Tesla_xAI_马斯克访谈完整纪要.docx
@@ -82,13 +82,12 @@
         <w:tblLook w:firstColumn="1" w:firstRow="1" w:lastColumn="0" w:lastRow="0" w:noHBand="0" w:noVBand="1" w:val="04A0"/>
       </w:tblPr>
       <w:tblGrid>
-        <w:gridCol w:w="1134"/>
-        <w:gridCol w:w="8504"/>
+        <w:gridCol w:w="9638"/>
       </w:tblGrid>
       <w:tr>
         <w:tc>
           <w:tcPr>
-            <w:tcW w:type="dxa" w:w="4819"/>
+            <w:tcW w:type="dxa" w:w="9638"/>
             <w:shd w:fill="EAF2F8"/>
             <w:tcBorders>
               <w:top w:val="nil"/>
@@ -96,72 +95,128 @@
               <w:left w:val="nil"/>
               <w:right w:val="nil"/>
             </w:tcBorders>
+            <w:tcMar>
+              <w:top w:w="180" w:type="dxa"/>
+              <w:left w:w="220" w:type="dxa"/>
+              <w:bottom w:w="180" w:type="dxa"/>
+              <w:right w:w="220" w:type="dxa"/>
+            </w:tcMar>
           </w:tcPr>
           <w:p>
+            <w:pPr>
+              <w:keepNext w:val="0"/>
+              <w:spacing w:after="140" w:line="276" w:lineRule="auto"/>
+              <w:ind w:left="0" w:right="0" w:firstLine="0"/>
+            </w:pPr>
             <w:r>
               <w:rPr>
                 <w:b/>
+                <w:sz w:val="24"/>
               </w:rPr>
               <w:t>会议总结</w:t>
             </w:r>
           </w:p>
-        </w:tc>
-        <w:tc>
-          <w:tcPr>
-            <w:tcW w:type="dxa" w:w="4819"/>
-            <w:shd w:fill="EAF2F8"/>
-            <w:tcBorders>
-              <w:top w:val="nil"/>
-              <w:bottom w:val="nil"/>
-              <w:left w:val="nil"/>
-              <w:right w:val="nil"/>
-            </w:tcBorders>
-          </w:tcPr>
           <w:p>
-            <w:r/>
+            <w:pPr>
+              <w:keepNext w:val="0"/>
+              <w:keepLines w:val="0"/>
+              <w:spacing w:line="276" w:lineRule="auto" w:before="0" w:after="140"/>
+              <w:ind w:left="0" w:right="0" w:firstLine="0"/>
+            </w:pPr>
+            <w:r>
+              <w:rPr>
+                <w:sz w:val="21"/>
+              </w:rPr>
+            </w:r>
             <w:r>
               <w:rPr>
                 <w:b/>
+                <w:sz w:val="21"/>
               </w:rPr>
               <w:t>关键数字：</w:t>
             </w:r>
             <w:r>
+              <w:rPr>
+                <w:sz w:val="21"/>
+              </w:rPr>
               <w:t xml:space="preserve"> 发电侧口述估算为每 110,000 张 GB300 约 300 MW，追问后又以 330,000 张约 1 GW 表述，包含配套、峰值冷却与检修余量；冷却约增 40%、检修再加 20%–25% 的乘数均有具体语境。Musk 预测太空部署 AI 在 30–36 个月内可能最经济；TeraFab 愿景包括 2030 年约 100 GW 电力与匹配芯片、每月百万片级晶圆，均非已建成产能。Optimus 3 对应约年产百万台设想，千万台级可能需 Optimus 4；真实训练机器人设想为至少万台，结合数百万台仿真机器人。</w:t>
             </w:r>
           </w:p>
           <w:p>
-            <w:r/>
+            <w:pPr>
+              <w:keepNext w:val="0"/>
+              <w:keepLines w:val="0"/>
+              <w:spacing w:line="276" w:lineRule="auto" w:before="0" w:after="140"/>
+              <w:ind w:left="0" w:right="0" w:firstLine="0"/>
+            </w:pPr>
+            <w:r>
+              <w:rPr>
+                <w:sz w:val="21"/>
+              </w:rPr>
+            </w:r>
             <w:r>
               <w:rPr>
                 <w:b/>
+                <w:sz w:val="21"/>
               </w:rPr>
               <w:t>核心观点：</w:t>
             </w:r>
             <w:r>
+              <w:rPr>
+                <w:sz w:val="21"/>
+              </w:rPr>
               <w:t xml:space="preserve"> 受访者用“持续解决当前限制因素”串联能源、芯片、机器人与工程组织：近期约束是电力，空间能源解锁后约束转为芯片；机器人要同时跨越智能、灵巧手和制造爬坡。主持人持续质疑空间方案的全成本、对齐逻辑、制造闭环和财政数字，若未被回答或验证，本文保留其未决状态。</w:t>
             </w:r>
           </w:p>
           <w:p>
-            <w:r/>
+            <w:pPr>
+              <w:keepNext w:val="0"/>
+              <w:keepLines w:val="0"/>
+              <w:spacing w:line="276" w:lineRule="auto" w:before="0" w:after="140"/>
+              <w:ind w:left="0" w:right="0" w:firstLine="0"/>
+            </w:pPr>
+            <w:r>
+              <w:rPr>
+                <w:sz w:val="21"/>
+              </w:rPr>
+            </w:r>
             <w:r>
               <w:rPr>
                 <w:b/>
+                <w:sz w:val="21"/>
               </w:rPr>
               <w:t>主持人提出的要求：</w:t>
             </w:r>
             <w:r>
+              <w:rPr>
+                <w:sz w:val="21"/>
+              </w:rPr>
               <w:t xml:space="preserve"> 请求解释空间经济性、技术与制造路径、xAI 差异化和收入来源，要求澄清供电估算与政府欺诈金额，追问 AI 对齐和政府使用边界。未形成带责任人、期限的正式交付要求。</w:t>
             </w:r>
           </w:p>
           <w:p>
-            <w:r/>
+            <w:pPr>
+              <w:keepNext w:val="0"/>
+              <w:keepLines w:val="0"/>
+              <w:spacing w:line="276" w:lineRule="auto" w:before="0" w:after="0"/>
+              <w:ind w:left="0" w:right="0" w:firstLine="0"/>
+            </w:pPr>
+            <w:r>
+              <w:rPr>
+                <w:sz w:val="21"/>
+              </w:rPr>
+            </w:r>
             <w:r>
               <w:rPr>
                 <w:b/>
+                <w:sz w:val="21"/>
               </w:rPr>
               <w:t>受访者提出的要求：</w:t>
             </w:r>
             <w:r>
+              <w:rPr>
+                <w:sz w:val="21"/>
+              </w:rPr>
               <w:t xml:space="preserve"> 对主持人未形成明确后续任务。受访者转述曾向 TSMC、Samsung、Micron 请求加快建厂并表示购买产出，属于对第三方的既有主张，不写成主持人承接的行动项。</w:t>
             </w:r>
           </w:p>
@@ -171,6 +226,7 @@
     <w:p>
       <w:pPr>
         <w:pStyle w:val="Heading1"/>
+        <w:pageBreakBefore/>
       </w:pPr>
       <w:r>
         <w:t>一 空间算力的论证围绕供电可获得性展开</w:t>

</xml_diff>